<commit_message>
E4 twin fidelity experiment + dead-reckoning seed fix
</commit_message>
<xml_diff>
--- a/doc/MissionDT_Manual_v1.docx
+++ b/doc/MissionDT_Manual_v1.docx
@@ -71,14 +71,7 @@
           <w:sz w:val="22"/>
           <w:szCs w:val="22"/>
         </w:rPr>
-        <w:t>GSE</w:t>
-      </w:r>
-      <w:r>
-        <w:rPr>
-          <w:sz w:val="22"/>
-          <w:szCs w:val="22"/>
-        </w:rPr>
-        <w:t xml:space="preserve"> / PUCRS — github.com/ProfessorFilipo/mission-dt</w:t>
+        <w:t>GSE / PUCRS — github.com/ProfessorFilipo/mission-dt</w:t>
       </w:r>
     </w:p>
     <w:p>
@@ -163,7 +156,7 @@
               <w:rPr>
                 <w:noProof/>
               </w:rPr>
-              <w:t>1</w:t>
+              <w:t>2</w:t>
             </w:r>
             <w:r>
               <w:rPr>
@@ -224,7 +217,7 @@
               <w:rPr>
                 <w:noProof/>
               </w:rPr>
-              <w:t>1</w:t>
+              <w:t>3</w:t>
             </w:r>
             <w:r>
               <w:rPr>
@@ -285,7 +278,7 @@
               <w:rPr>
                 <w:noProof/>
               </w:rPr>
-              <w:t>1</w:t>
+              <w:t>3</w:t>
             </w:r>
             <w:r>
               <w:rPr>
@@ -346,7 +339,7 @@
               <w:rPr>
                 <w:noProof/>
               </w:rPr>
-              <w:t>1</w:t>
+              <w:t>4</w:t>
             </w:r>
             <w:r>
               <w:rPr>
@@ -407,7 +400,7 @@
               <w:rPr>
                 <w:noProof/>
               </w:rPr>
-              <w:t>1</w:t>
+              <w:t>4</w:t>
             </w:r>
             <w:r>
               <w:rPr>
@@ -468,7 +461,7 @@
               <w:rPr>
                 <w:noProof/>
               </w:rPr>
-              <w:t>1</w:t>
+              <w:t>4</w:t>
             </w:r>
             <w:r>
               <w:rPr>
@@ -529,7 +522,7 @@
               <w:rPr>
                 <w:noProof/>
               </w:rPr>
-              <w:t>1</w:t>
+              <w:t>4</w:t>
             </w:r>
             <w:r>
               <w:rPr>
@@ -590,7 +583,7 @@
               <w:rPr>
                 <w:noProof/>
               </w:rPr>
-              <w:t>1</w:t>
+              <w:t>6</w:t>
             </w:r>
             <w:r>
               <w:rPr>
@@ -651,7 +644,7 @@
               <w:rPr>
                 <w:noProof/>
               </w:rPr>
-              <w:t>1</w:t>
+              <w:t>6</w:t>
             </w:r>
             <w:r>
               <w:rPr>
@@ -712,7 +705,7 @@
               <w:rPr>
                 <w:noProof/>
               </w:rPr>
-              <w:t>1</w:t>
+              <w:t>6</w:t>
             </w:r>
             <w:r>
               <w:rPr>
@@ -773,7 +766,7 @@
               <w:rPr>
                 <w:noProof/>
               </w:rPr>
-              <w:t>1</w:t>
+              <w:t>6</w:t>
             </w:r>
             <w:r>
               <w:rPr>
@@ -834,7 +827,7 @@
               <w:rPr>
                 <w:noProof/>
               </w:rPr>
-              <w:t>1</w:t>
+              <w:t>7</w:t>
             </w:r>
             <w:r>
               <w:rPr>
@@ -895,7 +888,7 @@
               <w:rPr>
                 <w:noProof/>
               </w:rPr>
-              <w:t>1</w:t>
+              <w:t>7</w:t>
             </w:r>
             <w:r>
               <w:rPr>
@@ -956,7 +949,7 @@
               <w:rPr>
                 <w:noProof/>
               </w:rPr>
-              <w:t>1</w:t>
+              <w:t>7</w:t>
             </w:r>
             <w:r>
               <w:rPr>
@@ -1017,7 +1010,7 @@
               <w:rPr>
                 <w:noProof/>
               </w:rPr>
-              <w:t>1</w:t>
+              <w:t>9</w:t>
             </w:r>
             <w:r>
               <w:rPr>
@@ -1078,7 +1071,7 @@
               <w:rPr>
                 <w:noProof/>
               </w:rPr>
-              <w:t>1</w:t>
+              <w:t>9</w:t>
             </w:r>
             <w:r>
               <w:rPr>
@@ -1139,7 +1132,7 @@
               <w:rPr>
                 <w:noProof/>
               </w:rPr>
-              <w:t>1</w:t>
+              <w:t>9</w:t>
             </w:r>
             <w:r>
               <w:rPr>
@@ -1200,7 +1193,7 @@
               <w:rPr>
                 <w:noProof/>
               </w:rPr>
-              <w:t>1</w:t>
+              <w:t>10</w:t>
             </w:r>
             <w:r>
               <w:rPr>
@@ -1261,7 +1254,7 @@
               <w:rPr>
                 <w:noProof/>
               </w:rPr>
-              <w:t>1</w:t>
+              <w:t>10</w:t>
             </w:r>
             <w:r>
               <w:rPr>
@@ -1322,7 +1315,7 @@
               <w:rPr>
                 <w:noProof/>
               </w:rPr>
-              <w:t>1</w:t>
+              <w:t>10</w:t>
             </w:r>
             <w:r>
               <w:rPr>
@@ -1383,7 +1376,7 @@
               <w:rPr>
                 <w:noProof/>
               </w:rPr>
-              <w:t>1</w:t>
+              <w:t>10</w:t>
             </w:r>
             <w:r>
               <w:rPr>
@@ -1444,7 +1437,7 @@
               <w:rPr>
                 <w:noProof/>
               </w:rPr>
-              <w:t>1</w:t>
+              <w:t>10</w:t>
             </w:r>
             <w:r>
               <w:rPr>
@@ -1505,7 +1498,7 @@
               <w:rPr>
                 <w:noProof/>
               </w:rPr>
-              <w:t>1</w:t>
+              <w:t>10</w:t>
             </w:r>
             <w:r>
               <w:rPr>
@@ -1566,7 +1559,7 @@
               <w:rPr>
                 <w:noProof/>
               </w:rPr>
-              <w:t>1</w:t>
+              <w:t>10</w:t>
             </w:r>
             <w:r>
               <w:rPr>
@@ -1627,7 +1620,7 @@
               <w:rPr>
                 <w:noProof/>
               </w:rPr>
-              <w:t>1</w:t>
+              <w:t>10</w:t>
             </w:r>
             <w:r>
               <w:rPr>
@@ -1688,7 +1681,7 @@
               <w:rPr>
                 <w:noProof/>
               </w:rPr>
-              <w:t>1</w:t>
+              <w:t>10</w:t>
             </w:r>
             <w:r>
               <w:rPr>
@@ -1749,7 +1742,7 @@
               <w:rPr>
                 <w:noProof/>
               </w:rPr>
-              <w:t>1</w:t>
+              <w:t>11</w:t>
             </w:r>
             <w:r>
               <w:rPr>
@@ -1810,7 +1803,7 @@
               <w:rPr>
                 <w:noProof/>
               </w:rPr>
-              <w:t>1</w:t>
+              <w:t>12</w:t>
             </w:r>
             <w:r>
               <w:rPr>
@@ -1871,7 +1864,7 @@
               <w:rPr>
                 <w:noProof/>
               </w:rPr>
-              <w:t>1</w:t>
+              <w:t>14</w:t>
             </w:r>
             <w:r>
               <w:rPr>
@@ -1932,7 +1925,7 @@
               <w:rPr>
                 <w:noProof/>
               </w:rPr>
-              <w:t>1</w:t>
+              <w:t>14</w:t>
             </w:r>
             <w:r>
               <w:rPr>
@@ -2229,12 +2222,6 @@
         <w:gridCol w:w="4700"/>
       </w:tblGrid>
       <w:tr>
-        <w:tblPrEx>
-          <w:tblCellMar>
-            <w:top w:w="0" w:type="dxa"/>
-            <w:bottom w:w="0" w:type="dxa"/>
-          </w:tblCellMar>
-        </w:tblPrEx>
         <w:tc>
           <w:tcPr>
             <w:tcW w:w="2900" w:type="dxa"/>
@@ -2309,12 +2296,6 @@
         </w:tc>
       </w:tr>
       <w:tr>
-        <w:tblPrEx>
-          <w:tblCellMar>
-            <w:top w:w="0" w:type="dxa"/>
-            <w:bottom w:w="0" w:type="dxa"/>
-          </w:tblCellMar>
-        </w:tblPrEx>
         <w:tc>
           <w:tcPr>
             <w:tcW w:w="2900" w:type="dxa"/>
@@ -2377,12 +2358,6 @@
         </w:tc>
       </w:tr>
       <w:tr>
-        <w:tblPrEx>
-          <w:tblCellMar>
-            <w:top w:w="0" w:type="dxa"/>
-            <w:bottom w:w="0" w:type="dxa"/>
-          </w:tblCellMar>
-        </w:tblPrEx>
         <w:tc>
           <w:tcPr>
             <w:tcW w:w="2900" w:type="dxa"/>
@@ -2445,12 +2420,6 @@
         </w:tc>
       </w:tr>
       <w:tr>
-        <w:tblPrEx>
-          <w:tblCellMar>
-            <w:top w:w="0" w:type="dxa"/>
-            <w:bottom w:w="0" w:type="dxa"/>
-          </w:tblCellMar>
-        </w:tblPrEx>
         <w:tc>
           <w:tcPr>
             <w:tcW w:w="2900" w:type="dxa"/>
@@ -2513,12 +2482,6 @@
         </w:tc>
       </w:tr>
       <w:tr>
-        <w:tblPrEx>
-          <w:tblCellMar>
-            <w:top w:w="0" w:type="dxa"/>
-            <w:bottom w:w="0" w:type="dxa"/>
-          </w:tblCellMar>
-        </w:tblPrEx>
         <w:tc>
           <w:tcPr>
             <w:tcW w:w="2900" w:type="dxa"/>
@@ -2581,12 +2544,6 @@
         </w:tc>
       </w:tr>
       <w:tr>
-        <w:tblPrEx>
-          <w:tblCellMar>
-            <w:top w:w="0" w:type="dxa"/>
-            <w:bottom w:w="0" w:type="dxa"/>
-          </w:tblCellMar>
-        </w:tblPrEx>
         <w:tc>
           <w:tcPr>
             <w:tcW w:w="2900" w:type="dxa"/>
@@ -3036,12 +2993,6 @@
         <w:gridCol w:w="6000"/>
       </w:tblGrid>
       <w:tr>
-        <w:tblPrEx>
-          <w:tblCellMar>
-            <w:top w:w="0" w:type="dxa"/>
-            <w:bottom w:w="0" w:type="dxa"/>
-          </w:tblCellMar>
-        </w:tblPrEx>
         <w:tc>
           <w:tcPr>
             <w:tcW w:w="1700" w:type="dxa"/>
@@ -3116,12 +3067,6 @@
         </w:tc>
       </w:tr>
       <w:tr>
-        <w:tblPrEx>
-          <w:tblCellMar>
-            <w:top w:w="0" w:type="dxa"/>
-            <w:bottom w:w="0" w:type="dxa"/>
-          </w:tblCellMar>
-        </w:tblPrEx>
         <w:tc>
           <w:tcPr>
             <w:tcW w:w="1700" w:type="dxa"/>
@@ -3184,12 +3129,6 @@
         </w:tc>
       </w:tr>
       <w:tr>
-        <w:tblPrEx>
-          <w:tblCellMar>
-            <w:top w:w="0" w:type="dxa"/>
-            <w:bottom w:w="0" w:type="dxa"/>
-          </w:tblCellMar>
-        </w:tblPrEx>
         <w:tc>
           <w:tcPr>
             <w:tcW w:w="1700" w:type="dxa"/>
@@ -3252,12 +3191,6 @@
         </w:tc>
       </w:tr>
       <w:tr>
-        <w:tblPrEx>
-          <w:tblCellMar>
-            <w:top w:w="0" w:type="dxa"/>
-            <w:bottom w:w="0" w:type="dxa"/>
-          </w:tblCellMar>
-        </w:tblPrEx>
         <w:tc>
           <w:tcPr>
             <w:tcW w:w="1700" w:type="dxa"/>
@@ -3320,12 +3253,6 @@
         </w:tc>
       </w:tr>
       <w:tr>
-        <w:tblPrEx>
-          <w:tblCellMar>
-            <w:top w:w="0" w:type="dxa"/>
-            <w:bottom w:w="0" w:type="dxa"/>
-          </w:tblCellMar>
-        </w:tblPrEx>
         <w:tc>
           <w:tcPr>
             <w:tcW w:w="1700" w:type="dxa"/>
@@ -3388,12 +3315,6 @@
         </w:tc>
       </w:tr>
       <w:tr>
-        <w:tblPrEx>
-          <w:tblCellMar>
-            <w:top w:w="0" w:type="dxa"/>
-            <w:bottom w:w="0" w:type="dxa"/>
-          </w:tblCellMar>
-        </w:tblPrEx>
         <w:tc>
           <w:tcPr>
             <w:tcW w:w="1700" w:type="dxa"/>
@@ -3456,12 +3377,6 @@
         </w:tc>
       </w:tr>
       <w:tr>
-        <w:tblPrEx>
-          <w:tblCellMar>
-            <w:top w:w="0" w:type="dxa"/>
-            <w:bottom w:w="0" w:type="dxa"/>
-          </w:tblCellMar>
-        </w:tblPrEx>
         <w:tc>
           <w:tcPr>
             <w:tcW w:w="1700" w:type="dxa"/>
@@ -3524,12 +3439,6 @@
         </w:tc>
       </w:tr>
       <w:tr>
-        <w:tblPrEx>
-          <w:tblCellMar>
-            <w:top w:w="0" w:type="dxa"/>
-            <w:bottom w:w="0" w:type="dxa"/>
-          </w:tblCellMar>
-        </w:tblPrEx>
         <w:tc>
           <w:tcPr>
             <w:tcW w:w="1700" w:type="dxa"/>
@@ -3592,12 +3501,6 @@
         </w:tc>
       </w:tr>
       <w:tr>
-        <w:tblPrEx>
-          <w:tblCellMar>
-            <w:top w:w="0" w:type="dxa"/>
-            <w:bottom w:w="0" w:type="dxa"/>
-          </w:tblCellMar>
-        </w:tblPrEx>
         <w:tc>
           <w:tcPr>
             <w:tcW w:w="1700" w:type="dxa"/>
@@ -3660,12 +3563,6 @@
         </w:tc>
       </w:tr>
       <w:tr>
-        <w:tblPrEx>
-          <w:tblCellMar>
-            <w:top w:w="0" w:type="dxa"/>
-            <w:bottom w:w="0" w:type="dxa"/>
-          </w:tblCellMar>
-        </w:tblPrEx>
         <w:tc>
           <w:tcPr>
             <w:tcW w:w="1700" w:type="dxa"/>
@@ -3914,12 +3811,6 @@
         <w:gridCol w:w="7800"/>
       </w:tblGrid>
       <w:tr>
-        <w:tblPrEx>
-          <w:tblCellMar>
-            <w:top w:w="0" w:type="dxa"/>
-            <w:bottom w:w="0" w:type="dxa"/>
-          </w:tblCellMar>
-        </w:tblPrEx>
         <w:tc>
           <w:tcPr>
             <w:tcW w:w="2200" w:type="dxa"/>
@@ -3970,12 +3861,6 @@
         </w:tc>
       </w:tr>
       <w:tr>
-        <w:tblPrEx>
-          <w:tblCellMar>
-            <w:top w:w="0" w:type="dxa"/>
-            <w:bottom w:w="0" w:type="dxa"/>
-          </w:tblCellMar>
-        </w:tblPrEx>
         <w:tc>
           <w:tcPr>
             <w:tcW w:w="2200" w:type="dxa"/>
@@ -4018,12 +3903,6 @@
         </w:tc>
       </w:tr>
       <w:tr>
-        <w:tblPrEx>
-          <w:tblCellMar>
-            <w:top w:w="0" w:type="dxa"/>
-            <w:bottom w:w="0" w:type="dxa"/>
-          </w:tblCellMar>
-        </w:tblPrEx>
         <w:tc>
           <w:tcPr>
             <w:tcW w:w="2200" w:type="dxa"/>
@@ -4066,12 +3945,6 @@
         </w:tc>
       </w:tr>
       <w:tr>
-        <w:tblPrEx>
-          <w:tblCellMar>
-            <w:top w:w="0" w:type="dxa"/>
-            <w:bottom w:w="0" w:type="dxa"/>
-          </w:tblCellMar>
-        </w:tblPrEx>
         <w:tc>
           <w:tcPr>
             <w:tcW w:w="2200" w:type="dxa"/>
@@ -4114,12 +3987,6 @@
         </w:tc>
       </w:tr>
       <w:tr>
-        <w:tblPrEx>
-          <w:tblCellMar>
-            <w:top w:w="0" w:type="dxa"/>
-            <w:bottom w:w="0" w:type="dxa"/>
-          </w:tblCellMar>
-        </w:tblPrEx>
         <w:tc>
           <w:tcPr>
             <w:tcW w:w="2200" w:type="dxa"/>
@@ -4162,12 +4029,6 @@
         </w:tc>
       </w:tr>
       <w:tr>
-        <w:tblPrEx>
-          <w:tblCellMar>
-            <w:top w:w="0" w:type="dxa"/>
-            <w:bottom w:w="0" w:type="dxa"/>
-          </w:tblCellMar>
-        </w:tblPrEx>
         <w:tc>
           <w:tcPr>
             <w:tcW w:w="2200" w:type="dxa"/>
@@ -4210,12 +4071,6 @@
         </w:tc>
       </w:tr>
       <w:tr>
-        <w:tblPrEx>
-          <w:tblCellMar>
-            <w:top w:w="0" w:type="dxa"/>
-            <w:bottom w:w="0" w:type="dxa"/>
-          </w:tblCellMar>
-        </w:tblPrEx>
         <w:tc>
           <w:tcPr>
             <w:tcW w:w="2200" w:type="dxa"/>
@@ -4258,12 +4113,6 @@
         </w:tc>
       </w:tr>
       <w:tr>
-        <w:tblPrEx>
-          <w:tblCellMar>
-            <w:top w:w="0" w:type="dxa"/>
-            <w:bottom w:w="0" w:type="dxa"/>
-          </w:tblCellMar>
-        </w:tblPrEx>
         <w:tc>
           <w:tcPr>
             <w:tcW w:w="2200" w:type="dxa"/>
@@ -5040,12 +4889,6 @@
         <w:gridCol w:w="6400"/>
       </w:tblGrid>
       <w:tr>
-        <w:tblPrEx>
-          <w:tblCellMar>
-            <w:top w:w="0" w:type="dxa"/>
-            <w:bottom w:w="0" w:type="dxa"/>
-          </w:tblCellMar>
-        </w:tblPrEx>
         <w:tc>
           <w:tcPr>
             <w:tcW w:w="3600" w:type="dxa"/>
@@ -5096,12 +4939,6 @@
         </w:tc>
       </w:tr>
       <w:tr>
-        <w:tblPrEx>
-          <w:tblCellMar>
-            <w:top w:w="0" w:type="dxa"/>
-            <w:bottom w:w="0" w:type="dxa"/>
-          </w:tblCellMar>
-        </w:tblPrEx>
         <w:tc>
           <w:tcPr>
             <w:tcW w:w="3600" w:type="dxa"/>
@@ -5144,12 +4981,6 @@
         </w:tc>
       </w:tr>
       <w:tr>
-        <w:tblPrEx>
-          <w:tblCellMar>
-            <w:top w:w="0" w:type="dxa"/>
-            <w:bottom w:w="0" w:type="dxa"/>
-          </w:tblCellMar>
-        </w:tblPrEx>
         <w:tc>
           <w:tcPr>
             <w:tcW w:w="3600" w:type="dxa"/>
@@ -5192,12 +5023,6 @@
         </w:tc>
       </w:tr>
       <w:tr>
-        <w:tblPrEx>
-          <w:tblCellMar>
-            <w:top w:w="0" w:type="dxa"/>
-            <w:bottom w:w="0" w:type="dxa"/>
-          </w:tblCellMar>
-        </w:tblPrEx>
         <w:tc>
           <w:tcPr>
             <w:tcW w:w="3600" w:type="dxa"/>
@@ -5240,12 +5065,6 @@
         </w:tc>
       </w:tr>
       <w:tr>
-        <w:tblPrEx>
-          <w:tblCellMar>
-            <w:top w:w="0" w:type="dxa"/>
-            <w:bottom w:w="0" w:type="dxa"/>
-          </w:tblCellMar>
-        </w:tblPrEx>
         <w:tc>
           <w:tcPr>
             <w:tcW w:w="3600" w:type="dxa"/>
@@ -5288,12 +5107,6 @@
         </w:tc>
       </w:tr>
       <w:tr>
-        <w:tblPrEx>
-          <w:tblCellMar>
-            <w:top w:w="0" w:type="dxa"/>
-            <w:bottom w:w="0" w:type="dxa"/>
-          </w:tblCellMar>
-        </w:tblPrEx>
         <w:tc>
           <w:tcPr>
             <w:tcW w:w="3600" w:type="dxa"/>
@@ -5336,12 +5149,6 @@
         </w:tc>
       </w:tr>
       <w:tr>
-        <w:tblPrEx>
-          <w:tblCellMar>
-            <w:top w:w="0" w:type="dxa"/>
-            <w:bottom w:w="0" w:type="dxa"/>
-          </w:tblCellMar>
-        </w:tblPrEx>
         <w:tc>
           <w:tcPr>
             <w:tcW w:w="3600" w:type="dxa"/>
@@ -5384,12 +5191,6 @@
         </w:tc>
       </w:tr>
       <w:tr>
-        <w:tblPrEx>
-          <w:tblCellMar>
-            <w:top w:w="0" w:type="dxa"/>
-            <w:bottom w:w="0" w:type="dxa"/>
-          </w:tblCellMar>
-        </w:tblPrEx>
         <w:tc>
           <w:tcPr>
             <w:tcW w:w="3600" w:type="dxa"/>

</xml_diff>